<commit_message>
Add Given/When/Then acceptance criteria to Need Help stories
Added Gherkin-style Given/When/Then scenarios to both the EDS Authoring and
ACCS Site Visit Need Help stories, covering rendering conditions, interaction,
responsive, accessibility, and performance.

Co-Authored-By: Claude Opus 4.6 (1M context) <noreply@anthropic.com>
</commit_message>
<xml_diff>
--- a/docs/SDD/Stories/Home-Page/EC-Need-Help-Section-Authoring-Story.docx
+++ b/docs/SDD/Stories/Home-Page/EC-Need-Help-Section-Authoring-Story.docx
@@ -1064,6 +1064,436 @@
         <w:pStyle w:val="Heading2"/>
       </w:pPr>
       <w:r>
+        <w:t>Acceptance Criteria (Given / When / Then)</w:t>
+      </w:r>
+    </w:p>
+    <w:p>
+      <w:r>
+        <w:rPr>
+          <w:b/>
+        </w:rPr>
+        <w:t>Scenario A1 — Add the block</w:t>
+      </w:r>
+    </w:p>
+    <w:p>
+      <w:pPr>
+        <w:pStyle w:val="ListBullet"/>
+      </w:pPr>
+      <w:r>
+        <w:rPr>
+          <w:b/>
+        </w:rPr>
+        <w:t>Given</w:t>
+      </w:r>
+      <w:r>
+        <w:t xml:space="preserve"> an author is editing a page document in DA</w:t>
+      </w:r>
+    </w:p>
+    <w:p>
+      <w:pPr>
+        <w:pStyle w:val="ListBullet"/>
+      </w:pPr>
+      <w:r>
+        <w:rPr>
+          <w:b/>
+        </w:rPr>
+        <w:t>When</w:t>
+      </w:r>
+      <w:r>
+        <w:t xml:space="preserve"> they insert the </w:t>
+      </w:r>
+      <w:r>
+        <w:rPr>
+          <w:rFonts w:ascii="Consolas" w:hAnsi="Consolas"/>
+          <w:color w:val="8B0000"/>
+          <w:sz w:val="18"/>
+        </w:rPr>
+        <w:t>Need Help</w:t>
+      </w:r>
+      <w:r>
+        <w:t xml:space="preserve"> block</w:t>
+      </w:r>
+    </w:p>
+    <w:p>
+      <w:pPr>
+        <w:pStyle w:val="ListBullet"/>
+      </w:pPr>
+      <w:r>
+        <w:rPr>
+          <w:b/>
+        </w:rPr>
+        <w:t>Then</w:t>
+      </w:r>
+      <w:r>
+        <w:t xml:space="preserve"> the block appears in the document and renders in preview.</w:t>
+      </w:r>
+    </w:p>
+    <w:p>
+      <w:r>
+        <w:rPr>
+          <w:b/>
+        </w:rPr>
+        <w:t>Scenario A2 — Author the message</w:t>
+      </w:r>
+    </w:p>
+    <w:p>
+      <w:pPr>
+        <w:pStyle w:val="ListBullet"/>
+      </w:pPr>
+      <w:r>
+        <w:rPr>
+          <w:b/>
+        </w:rPr>
+        <w:t>Given</w:t>
+      </w:r>
+      <w:r>
+        <w:t xml:space="preserve"> the </w:t>
+      </w:r>
+      <w:r>
+        <w:rPr>
+          <w:rFonts w:ascii="Consolas" w:hAnsi="Consolas"/>
+          <w:color w:val="8B0000"/>
+          <w:sz w:val="18"/>
+        </w:rPr>
+        <w:t>Need Help</w:t>
+      </w:r>
+      <w:r>
+        <w:t xml:space="preserve"> block is in the document</w:t>
+      </w:r>
+    </w:p>
+    <w:p>
+      <w:pPr>
+        <w:pStyle w:val="ListBullet"/>
+      </w:pPr>
+      <w:r>
+        <w:rPr>
+          <w:b/>
+        </w:rPr>
+        <w:t>When</w:t>
+      </w:r>
+      <w:r>
+        <w:t xml:space="preserve"> the author enters message text and previews/publishes</w:t>
+      </w:r>
+    </w:p>
+    <w:p>
+      <w:pPr>
+        <w:pStyle w:val="ListBullet"/>
+      </w:pPr>
+      <w:r>
+        <w:rPr>
+          <w:b/>
+        </w:rPr>
+        <w:t>Then</w:t>
+      </w:r>
+      <w:r>
+        <w:t xml:space="preserve"> the entered message renders as the section heading.</w:t>
+      </w:r>
+    </w:p>
+    <w:p>
+      <w:r>
+        <w:rPr>
+          <w:b/>
+        </w:rPr>
+        <w:t>Scenario A3 — Optional supporting line omitted</w:t>
+      </w:r>
+    </w:p>
+    <w:p>
+      <w:pPr>
+        <w:pStyle w:val="ListBullet"/>
+      </w:pPr>
+      <w:r>
+        <w:rPr>
+          <w:b/>
+        </w:rPr>
+        <w:t>Given</w:t>
+      </w:r>
+      <w:r>
+        <w:t xml:space="preserve"> the block has a message but no supporting line</w:t>
+      </w:r>
+    </w:p>
+    <w:p>
+      <w:pPr>
+        <w:pStyle w:val="ListBullet"/>
+      </w:pPr>
+      <w:r>
+        <w:rPr>
+          <w:b/>
+        </w:rPr>
+        <w:t>When</w:t>
+      </w:r>
+      <w:r>
+        <w:t xml:space="preserve"> the author previews/publishes</w:t>
+      </w:r>
+    </w:p>
+    <w:p>
+      <w:pPr>
+        <w:pStyle w:val="ListBullet"/>
+      </w:pPr>
+      <w:r>
+        <w:rPr>
+          <w:b/>
+        </w:rPr>
+        <w:t>Then</w:t>
+      </w:r>
+      <w:r>
+        <w:t xml:space="preserve"> the block renders the message with no supporting line and no empty gap.</w:t>
+      </w:r>
+    </w:p>
+    <w:p>
+      <w:r>
+        <w:rPr>
+          <w:b/>
+        </w:rPr>
+        <w:t>Scenario A4 — Author the CTA label and link</w:t>
+      </w:r>
+    </w:p>
+    <w:p>
+      <w:pPr>
+        <w:pStyle w:val="ListBullet"/>
+      </w:pPr>
+      <w:r>
+        <w:rPr>
+          <w:b/>
+        </w:rPr>
+        <w:t>Given</w:t>
+      </w:r>
+      <w:r>
+        <w:t xml:space="preserve"> the block is in the document</w:t>
+      </w:r>
+    </w:p>
+    <w:p>
+      <w:pPr>
+        <w:pStyle w:val="ListBullet"/>
+      </w:pPr>
+      <w:r>
+        <w:rPr>
+          <w:b/>
+        </w:rPr>
+        <w:t>When</w:t>
+      </w:r>
+      <w:r>
+        <w:t xml:space="preserve"> the author enters a CTA label and a URL</w:t>
+      </w:r>
+    </w:p>
+    <w:p>
+      <w:pPr>
+        <w:pStyle w:val="ListBullet"/>
+      </w:pPr>
+      <w:r>
+        <w:rPr>
+          <w:b/>
+        </w:rPr>
+        <w:t>Then</w:t>
+      </w:r>
+      <w:r>
+        <w:t xml:space="preserve"> the CTA renders with that label and links to the given URL.</w:t>
+      </w:r>
+    </w:p>
+    <w:p>
+      <w:r>
+        <w:rPr>
+          <w:b/>
+        </w:rPr>
+        <w:t>Scenario A5 — CTA omitted</w:t>
+      </w:r>
+    </w:p>
+    <w:p>
+      <w:pPr>
+        <w:pStyle w:val="ListBullet"/>
+      </w:pPr>
+      <w:r>
+        <w:rPr>
+          <w:b/>
+        </w:rPr>
+        <w:t>Given</w:t>
+      </w:r>
+      <w:r>
+        <w:t xml:space="preserve"> the block has no CTA label and no CTA link</w:t>
+      </w:r>
+    </w:p>
+    <w:p>
+      <w:pPr>
+        <w:pStyle w:val="ListBullet"/>
+      </w:pPr>
+      <w:r>
+        <w:rPr>
+          <w:b/>
+        </w:rPr>
+        <w:t>When</w:t>
+      </w:r>
+      <w:r>
+        <w:t xml:space="preserve"> the author previews/publishes</w:t>
+      </w:r>
+    </w:p>
+    <w:p>
+      <w:pPr>
+        <w:pStyle w:val="ListBullet"/>
+      </w:pPr>
+      <w:r>
+        <w:rPr>
+          <w:b/>
+        </w:rPr>
+        <w:t>Then</w:t>
+      </w:r>
+      <w:r>
+        <w:t xml:space="preserve"> no CTA is rendered and the block layout remains intact.</w:t>
+      </w:r>
+    </w:p>
+    <w:p>
+      <w:r>
+        <w:rPr>
+          <w:b/>
+        </w:rPr>
+        <w:t>Scenario A6 — No mandatory fields</w:t>
+      </w:r>
+    </w:p>
+    <w:p>
+      <w:pPr>
+        <w:pStyle w:val="ListBullet"/>
+      </w:pPr>
+      <w:r>
+        <w:rPr>
+          <w:b/>
+        </w:rPr>
+        <w:t>Given</w:t>
+      </w:r>
+      <w:r>
+        <w:t xml:space="preserve"> the author leaves any subset of fields empty (including all)</w:t>
+      </w:r>
+    </w:p>
+    <w:p>
+      <w:pPr>
+        <w:pStyle w:val="ListBullet"/>
+      </w:pPr>
+      <w:r>
+        <w:rPr>
+          <w:b/>
+        </w:rPr>
+        <w:t>When</w:t>
+      </w:r>
+      <w:r>
+        <w:t xml:space="preserve"> they save and preview</w:t>
+      </w:r>
+    </w:p>
+    <w:p>
+      <w:pPr>
+        <w:pStyle w:val="ListBullet"/>
+      </w:pPr>
+      <w:r>
+        <w:rPr>
+          <w:b/>
+        </w:rPr>
+        <w:t>Then</w:t>
+      </w:r>
+      <w:r>
+        <w:t xml:space="preserve"> the block saves and renders without error.</w:t>
+      </w:r>
+    </w:p>
+    <w:p>
+      <w:r>
+        <w:rPr>
+          <w:b/>
+        </w:rPr>
+        <w:t>Scenario A7 — Graceful blank</w:t>
+      </w:r>
+    </w:p>
+    <w:p>
+      <w:pPr>
+        <w:pStyle w:val="ListBullet"/>
+      </w:pPr>
+      <w:r>
+        <w:rPr>
+          <w:b/>
+        </w:rPr>
+        <w:t>Given</w:t>
+      </w:r>
+      <w:r>
+        <w:t xml:space="preserve"> one or more fields are empty</w:t>
+      </w:r>
+    </w:p>
+    <w:p>
+      <w:pPr>
+        <w:pStyle w:val="ListBullet"/>
+      </w:pPr>
+      <w:r>
+        <w:rPr>
+          <w:b/>
+        </w:rPr>
+        <w:t>When</w:t>
+      </w:r>
+      <w:r>
+        <w:t xml:space="preserve"> the block renders</w:t>
+      </w:r>
+    </w:p>
+    <w:p>
+      <w:pPr>
+        <w:pStyle w:val="ListBullet"/>
+      </w:pPr>
+      <w:r>
+        <w:rPr>
+          <w:b/>
+        </w:rPr>
+        <w:t>Then</w:t>
+      </w:r>
+      <w:r>
+        <w:t xml:space="preserve"> only the empty elements are omitted, with no broken layout and no placeholder text.</w:t>
+      </w:r>
+    </w:p>
+    <w:p>
+      <w:r>
+        <w:rPr>
+          <w:b/>
+        </w:rPr>
+        <w:t>Scenario A8 — Preview parity</w:t>
+      </w:r>
+    </w:p>
+    <w:p>
+      <w:pPr>
+        <w:pStyle w:val="ListBullet"/>
+      </w:pPr>
+      <w:r>
+        <w:rPr>
+          <w:b/>
+        </w:rPr>
+        <w:t>Given</w:t>
+      </w:r>
+      <w:r>
+        <w:t xml:space="preserve"> the author has authored/edited the block</w:t>
+      </w:r>
+    </w:p>
+    <w:p>
+      <w:pPr>
+        <w:pStyle w:val="ListBullet"/>
+      </w:pPr>
+      <w:r>
+        <w:rPr>
+          <w:b/>
+        </w:rPr>
+        <w:t>When</w:t>
+      </w:r>
+      <w:r>
+        <w:t xml:space="preserve"> they view DA preview</w:t>
+      </w:r>
+    </w:p>
+    <w:p>
+      <w:pPr>
+        <w:pStyle w:val="ListBullet"/>
+      </w:pPr>
+      <w:r>
+        <w:rPr>
+          <w:b/>
+        </w:rPr>
+        <w:t>Then</w:t>
+      </w:r>
+      <w:r>
+        <w:t xml:space="preserve"> the preview matches what will render on the published site.</w:t>
+      </w:r>
+    </w:p>
+    <w:p>
+      <w:pPr>
+        <w:pStyle w:val="Heading2"/>
+      </w:pPr>
+      <w:r>
         <w:t>Dependencies</w:t>
       </w:r>
     </w:p>

</xml_diff>